<commit_message>
Sekil 4'u modernize et: jitter'li swarm-scatter, arka plan bantlari, sadece bilgilendirici 3 nokta etiketlenir
Onceki versiyon 17 basarisiz ornegin tumunu sol tarafta ust uste yigilmis
etiketlerle gosteriyordu (dagimik gorunum). Yeni versiyon: basarili/basarisiz
bantlari renkli arka planla ayrilir, ust uste binen noktalar hafif dusey
jitter ile ayristirilir, yalnizca metinde tartisilan 3 nokta (en uzun PASS,
iki uzun FAIL) etiketlenir, legend eklendi.
</commit_message>
<xml_diff>
--- a/makale_v12.docx
+++ b/makale_v12.docx
@@ -3895,7 +3895,7 @@
       <w:r>
         <w:drawing>
           <wp:inline xmlns:a="http://schemas.openxmlformats.org/drawingml/2006/main" xmlns:pic="http://schemas.openxmlformats.org/drawingml/2006/picture">
-            <wp:extent cx="5029200" cy="3204087"/>
+            <wp:extent cx="5029200" cy="2732400"/>
             <wp:docPr id="3" name="Picture 3"/>
             <wp:cNvGraphicFramePr>
               <a:graphicFrameLocks noChangeAspect="1"/>
@@ -3916,7 +3916,7 @@
                   <pic:spPr>
                     <a:xfrm>
                       <a:off x="0" y="0"/>
-                      <a:ext cx="5029200" cy="3204087"/>
+                      <a:ext cx="5029200" cy="2732400"/>
                     </a:xfrm>
                     <a:prstGeom prst="rect"/>
                   </pic:spPr>

</xml_diff>